<commit_message>
Update DevOps CI/CD and Docker manual with corrections and improvements
</commit_message>
<xml_diff>
--- a/04-week/02-session/02-activity/ManualDocker.docx
+++ b/04-week/02-session/02-activity/ManualDocker.docx
@@ -5,8 +5,14 @@
     <w:p>
       <w:pPr>
         <w:pStyle w:val="Ttulo"/>
+        <w:rPr>
+          <w:lang w:val="es-CO"/>
+        </w:rPr>
       </w:pPr>
       <w:r>
+        <w:rPr>
+          <w:lang w:val="es-CO"/>
+        </w:rPr>
         <w:t>Manual de DevOps – CI/CD y Docker</w:t>
       </w:r>
     </w:p>
@@ -16,64 +22,201 @@
       </w:r>
     </w:p>
     <w:p>
-      <w:r>
+      <w:pPr>
+        <w:rPr>
+          <w:u w:val="single"/>
+          <w:lang w:val="es-CO"/>
+        </w:rPr>
+      </w:pPr>
+      <w:r>
+        <w:rPr>
+          <w:lang w:val="es-CO"/>
+        </w:rPr>
         <w:t xml:space="preserve">Autor: </w:t>
       </w:r>
-      <w:r>
-        <w:t>Andres Felipe Morales Casanova</w:t>
+      <w:proofErr w:type="spellStart"/>
+      <w:r>
+        <w:rPr>
+          <w:lang w:val="es-CO"/>
+        </w:rPr>
+        <w:t>Julian</w:t>
+      </w:r>
+      <w:proofErr w:type="spellEnd"/>
+      <w:r>
+        <w:rPr>
+          <w:lang w:val="es-CO"/>
+        </w:rPr>
+        <w:t xml:space="preserve"> David N</w:t>
+      </w:r>
+      <w:r>
+        <w:rPr>
+          <w:lang w:val="es-CO"/>
+        </w:rPr>
+        <w:t>aranjo Pascuas</w:t>
       </w:r>
     </w:p>
     <w:p>
-      <w:r>
+      <w:pPr>
+        <w:rPr>
+          <w:lang w:val="es-CO"/>
+        </w:rPr>
+      </w:pPr>
+      <w:r>
+        <w:rPr>
+          <w:lang w:val="es-CO"/>
+        </w:rPr>
         <w:t xml:space="preserve">Fecha: </w:t>
       </w:r>
       <w:r>
+        <w:rPr>
+          <w:lang w:val="es-CO"/>
+        </w:rPr>
         <w:t>09/09/2025</w:t>
       </w:r>
     </w:p>
     <w:p>
-      <w:r>
+      <w:pPr>
+        <w:rPr>
+          <w:lang w:val="es-CO"/>
+        </w:rPr>
+      </w:pPr>
+      <w:r>
+        <w:rPr>
+          <w:lang w:val="es-CO"/>
+        </w:rPr>
         <w:br w:type="page"/>
       </w:r>
     </w:p>
     <w:p>
       <w:pPr>
         <w:pStyle w:val="Ttulo1"/>
+        <w:rPr>
+          <w:lang w:val="es-CO"/>
+        </w:rPr>
       </w:pPr>
       <w:r>
+        <w:rPr>
+          <w:lang w:val="es-CO"/>
+        </w:rPr>
         <w:lastRenderedPageBreak/>
         <w:t>Índice</w:t>
       </w:r>
     </w:p>
     <w:p>
-      <w:r>
+      <w:pPr>
+        <w:rPr>
+          <w:lang w:val="es-CO"/>
+        </w:rPr>
+      </w:pPr>
+      <w:r>
+        <w:rPr>
+          <w:lang w:val="es-CO"/>
+        </w:rPr>
         <w:t>1. Introducción</w:t>
       </w:r>
     </w:p>
     <w:p>
-      <w:r>
-        <w:t>2. Dockerización del Backend</w:t>
-      </w:r>
+      <w:pPr>
+        <w:rPr>
+          <w:lang w:val="es-CO"/>
+        </w:rPr>
+      </w:pPr>
+      <w:r>
+        <w:rPr>
+          <w:lang w:val="es-CO"/>
+        </w:rPr>
+        <w:t xml:space="preserve">2. </w:t>
+      </w:r>
+      <w:proofErr w:type="spellStart"/>
+      <w:r>
+        <w:rPr>
+          <w:lang w:val="es-CO"/>
+        </w:rPr>
+        <w:t>Dockerización</w:t>
+      </w:r>
+      <w:proofErr w:type="spellEnd"/>
+      <w:r>
+        <w:rPr>
+          <w:lang w:val="es-CO"/>
+        </w:rPr>
+        <w:t xml:space="preserve"> del </w:t>
+      </w:r>
+      <w:proofErr w:type="spellStart"/>
+      <w:r>
+        <w:rPr>
+          <w:lang w:val="es-CO"/>
+        </w:rPr>
+        <w:t>Backend</w:t>
+      </w:r>
+      <w:proofErr w:type="spellEnd"/>
     </w:p>
     <w:p>
-      <w:r>
-        <w:t xml:space="preserve">   2.1 Creación del Dockerfile</w:t>
-      </w:r>
+      <w:pPr>
+        <w:rPr>
+          <w:lang w:val="es-CO"/>
+        </w:rPr>
+      </w:pPr>
+      <w:r>
+        <w:rPr>
+          <w:lang w:val="es-CO"/>
+        </w:rPr>
+        <w:t xml:space="preserve">   2.1 Creación del </w:t>
+      </w:r>
+      <w:proofErr w:type="spellStart"/>
+      <w:r>
+        <w:rPr>
+          <w:lang w:val="es-CO"/>
+        </w:rPr>
+        <w:t>Dockerfile</w:t>
+      </w:r>
+      <w:proofErr w:type="spellEnd"/>
     </w:p>
     <w:p>
-      <w:r>
+      <w:pPr>
+        <w:rPr>
+          <w:lang w:val="es-CO"/>
+        </w:rPr>
+      </w:pPr>
+      <w:r>
+        <w:rPr>
+          <w:lang w:val="es-CO"/>
+        </w:rPr>
         <w:t xml:space="preserve">   2.2 Construcción de la Imagen</w:t>
       </w:r>
     </w:p>
     <w:p>
-      <w:r>
+      <w:pPr>
+        <w:rPr>
+          <w:lang w:val="es-CO"/>
+        </w:rPr>
+      </w:pPr>
+      <w:r>
+        <w:rPr>
+          <w:lang w:val="es-CO"/>
+        </w:rPr>
         <w:t xml:space="preserve">   2.3 Ejecución de Contenedor</w:t>
       </w:r>
     </w:p>
     <w:p>
-      <w:r>
-        <w:t xml:space="preserve">   2.4 Uso de docker-compose</w:t>
-      </w:r>
+      <w:pPr>
+        <w:rPr>
+          <w:lang w:val="es-CO"/>
+        </w:rPr>
+      </w:pPr>
+      <w:r>
+        <w:rPr>
+          <w:lang w:val="es-CO"/>
+        </w:rPr>
+        <w:t xml:space="preserve">   2.4 Uso de </w:t>
+      </w:r>
+      <w:proofErr w:type="spellStart"/>
+      <w:r>
+        <w:rPr>
+          <w:lang w:val="es-CO"/>
+        </w:rPr>
+        <w:t>docker-compose</w:t>
+      </w:r>
+      <w:proofErr w:type="spellEnd"/>
     </w:p>
     <w:p>
       <w:r>
@@ -81,73 +224,266 @@
       </w:r>
     </w:p>
     <w:p>
-      <w:r>
-        <w:t xml:space="preserve">   3.1 Configuración del Workflow</w:t>
-      </w:r>
+      <w:pPr>
+        <w:rPr>
+          <w:lang w:val="es-CO"/>
+        </w:rPr>
+      </w:pPr>
+      <w:r>
+        <w:t xml:space="preserve">   </w:t>
+      </w:r>
+      <w:r>
+        <w:rPr>
+          <w:lang w:val="es-CO"/>
+        </w:rPr>
+        <w:t xml:space="preserve">3.1 Configuración del </w:t>
+      </w:r>
+      <w:proofErr w:type="spellStart"/>
+      <w:r>
+        <w:rPr>
+          <w:lang w:val="es-CO"/>
+        </w:rPr>
+        <w:t>Workflow</w:t>
+      </w:r>
+      <w:proofErr w:type="spellEnd"/>
     </w:p>
     <w:p>
-      <w:r>
-        <w:t xml:space="preserve">   3.2 Configuración de Secrets</w:t>
-      </w:r>
+      <w:pPr>
+        <w:rPr>
+          <w:lang w:val="es-CO"/>
+        </w:rPr>
+      </w:pPr>
+      <w:r>
+        <w:rPr>
+          <w:lang w:val="es-CO"/>
+        </w:rPr>
+        <w:t xml:space="preserve">   3.2 Configuración de </w:t>
+      </w:r>
+      <w:proofErr w:type="spellStart"/>
+      <w:r>
+        <w:rPr>
+          <w:lang w:val="es-CO"/>
+        </w:rPr>
+        <w:t>Secrets</w:t>
+      </w:r>
+      <w:proofErr w:type="spellEnd"/>
     </w:p>
     <w:p>
-      <w:r>
+      <w:pPr>
+        <w:rPr>
+          <w:lang w:val="es-CO"/>
+        </w:rPr>
+      </w:pPr>
+      <w:r>
+        <w:rPr>
+          <w:lang w:val="es-CO"/>
+        </w:rPr>
         <w:t xml:space="preserve">   3.3 Ejecución del Pipeline</w:t>
       </w:r>
     </w:p>
     <w:p>
-      <w:r>
+      <w:pPr>
+        <w:rPr>
+          <w:lang w:val="es-CO"/>
+        </w:rPr>
+      </w:pPr>
+      <w:r>
+        <w:rPr>
+          <w:lang w:val="es-CO"/>
+        </w:rPr>
         <w:t>4. Evidencias de Pruebas</w:t>
       </w:r>
     </w:p>
     <w:p>
-      <w:r>
+      <w:pPr>
+        <w:rPr>
+          <w:lang w:val="es-CO"/>
+        </w:rPr>
+      </w:pPr>
+      <w:r>
+        <w:rPr>
+          <w:lang w:val="es-CO"/>
+        </w:rPr>
         <w:t>5. Conclusiones</w:t>
       </w:r>
     </w:p>
     <w:p>
-      <w:r>
+      <w:pPr>
+        <w:rPr>
+          <w:lang w:val="es-CO"/>
+        </w:rPr>
+      </w:pPr>
+      <w:r>
+        <w:rPr>
+          <w:lang w:val="es-CO"/>
+        </w:rPr>
         <w:br w:type="page"/>
       </w:r>
     </w:p>
     <w:p>
       <w:pPr>
         <w:pStyle w:val="Ttulo1"/>
+        <w:rPr>
+          <w:lang w:val="es-CO"/>
+        </w:rPr>
       </w:pPr>
       <w:r>
+        <w:rPr>
+          <w:lang w:val="es-CO"/>
+        </w:rPr>
         <w:lastRenderedPageBreak/>
         <w:t>1. Introducción</w:t>
       </w:r>
     </w:p>
     <w:p>
-      <w:r>
-        <w:t>Este manual explica paso a paso cómo se realizó la dockerización y la configuración de un pipeline CI/CD para el proyecto Flight Management System en Spring Boot. Incluye capturas de pantalla y explicaciones que permiten replicar el proceso.</w:t>
+      <w:pPr>
+        <w:rPr>
+          <w:lang w:val="es-CO"/>
+        </w:rPr>
+      </w:pPr>
+      <w:r>
+        <w:rPr>
+          <w:lang w:val="es-CO"/>
+        </w:rPr>
+        <w:t xml:space="preserve">Este manual explica paso a paso cómo se realizó la </w:t>
+      </w:r>
+      <w:proofErr w:type="spellStart"/>
+      <w:r>
+        <w:rPr>
+          <w:lang w:val="es-CO"/>
+        </w:rPr>
+        <w:t>dockerización</w:t>
+      </w:r>
+      <w:proofErr w:type="spellEnd"/>
+      <w:r>
+        <w:rPr>
+          <w:lang w:val="es-CO"/>
+        </w:rPr>
+        <w:t xml:space="preserve"> y la configuración de un pipeline CI/CD para el proyecto Flight Management </w:t>
+      </w:r>
+      <w:proofErr w:type="spellStart"/>
+      <w:r>
+        <w:rPr>
+          <w:lang w:val="es-CO"/>
+        </w:rPr>
+        <w:t>System</w:t>
+      </w:r>
+      <w:proofErr w:type="spellEnd"/>
+      <w:r>
+        <w:rPr>
+          <w:lang w:val="es-CO"/>
+        </w:rPr>
+        <w:t xml:space="preserve"> en Spring </w:t>
+      </w:r>
+      <w:proofErr w:type="spellStart"/>
+      <w:r>
+        <w:rPr>
+          <w:lang w:val="es-CO"/>
+        </w:rPr>
+        <w:t>Boot</w:t>
+      </w:r>
+      <w:proofErr w:type="spellEnd"/>
+      <w:r>
+        <w:rPr>
+          <w:lang w:val="es-CO"/>
+        </w:rPr>
+        <w:t>. Incluye capturas de pantalla y explicaciones que permiten replicar el proceso.</w:t>
       </w:r>
     </w:p>
     <w:p>
       <w:pPr>
         <w:pStyle w:val="Ttulo1"/>
+        <w:rPr>
+          <w:lang w:val="es-CO"/>
+        </w:rPr>
       </w:pPr>
       <w:r>
-        <w:t>2. Dockerización del Backend</w:t>
-      </w:r>
+        <w:rPr>
+          <w:lang w:val="es-CO"/>
+        </w:rPr>
+        <w:t xml:space="preserve">2. </w:t>
+      </w:r>
+      <w:proofErr w:type="spellStart"/>
+      <w:r>
+        <w:rPr>
+          <w:lang w:val="es-CO"/>
+        </w:rPr>
+        <w:t>Dockerización</w:t>
+      </w:r>
+      <w:proofErr w:type="spellEnd"/>
+      <w:r>
+        <w:rPr>
+          <w:lang w:val="es-CO"/>
+        </w:rPr>
+        <w:t xml:space="preserve"> del </w:t>
+      </w:r>
+      <w:proofErr w:type="spellStart"/>
+      <w:r>
+        <w:rPr>
+          <w:lang w:val="es-CO"/>
+        </w:rPr>
+        <w:t>Backend</w:t>
+      </w:r>
+      <w:proofErr w:type="spellEnd"/>
     </w:p>
     <w:p>
       <w:pPr>
         <w:pStyle w:val="Ttulo2"/>
+        <w:rPr>
+          <w:lang w:val="es-CO"/>
+        </w:rPr>
       </w:pPr>
       <w:r>
-        <w:t>2.1 Creación del Dockerfile</w:t>
-      </w:r>
+        <w:rPr>
+          <w:lang w:val="es-CO"/>
+        </w:rPr>
+        <w:t xml:space="preserve">2.1 Creación del </w:t>
+      </w:r>
+      <w:proofErr w:type="spellStart"/>
+      <w:r>
+        <w:rPr>
+          <w:lang w:val="es-CO"/>
+        </w:rPr>
+        <w:t>Dockerfile</w:t>
+      </w:r>
+      <w:proofErr w:type="spellEnd"/>
     </w:p>
     <w:p>
-      <w:r>
-        <w:t>Captura 1: Contenido del Dockerfile en el IDE.</w:t>
-      </w:r>
-      <w:r>
+      <w:pPr>
+        <w:rPr>
+          <w:lang w:val="es-CO"/>
+        </w:rPr>
+      </w:pPr>
+      <w:r>
+        <w:rPr>
+          <w:lang w:val="es-CO"/>
+        </w:rPr>
+        <w:t xml:space="preserve">Captura 1: Contenido del </w:t>
+      </w:r>
+      <w:proofErr w:type="spellStart"/>
+      <w:r>
+        <w:rPr>
+          <w:lang w:val="es-CO"/>
+        </w:rPr>
+        <w:t>Dockerfile</w:t>
+      </w:r>
+      <w:proofErr w:type="spellEnd"/>
+      <w:r>
+        <w:rPr>
+          <w:lang w:val="es-CO"/>
+        </w:rPr>
+        <w:t xml:space="preserve"> en el IDE.</w:t>
+      </w:r>
+      <w:r>
+        <w:rPr>
+          <w:lang w:val="es-CO"/>
+        </w:rPr>
         <w:br/>
       </w:r>
       <w:r>
+        <w:rPr>
+          <w:noProof/>
+        </w:rPr>
         <w:drawing>
           <wp:inline distT="0" distB="0" distL="0" distR="0" wp14:anchorId="6E7D8565" wp14:editId="6588FA3A">
             <wp:extent cx="5486400" cy="2913380"/>
@@ -188,20 +524,68 @@
     <w:p>
       <w:pPr>
         <w:pStyle w:val="Ttulo2"/>
+        <w:rPr>
+          <w:lang w:val="es-CO"/>
+        </w:rPr>
       </w:pPr>
       <w:r>
+        <w:rPr>
+          <w:lang w:val="es-CO"/>
+        </w:rPr>
         <w:lastRenderedPageBreak/>
         <w:t>2.2 Construcción de la Imagen</w:t>
       </w:r>
     </w:p>
     <w:p>
-      <w:r>
-        <w:t>Captura 2: Ejecución del comando 'docker build'.</w:t>
-      </w:r>
-      <w:r>
+      <w:pPr>
+        <w:rPr>
+          <w:lang w:val="es-CO"/>
+        </w:rPr>
+      </w:pPr>
+      <w:r>
+        <w:rPr>
+          <w:lang w:val="es-CO"/>
+        </w:rPr>
+        <w:t>Captura 2: Ejecución del comando '</w:t>
+      </w:r>
+      <w:proofErr w:type="spellStart"/>
+      <w:r>
+        <w:rPr>
+          <w:lang w:val="es-CO"/>
+        </w:rPr>
+        <w:t>docker</w:t>
+      </w:r>
+      <w:proofErr w:type="spellEnd"/>
+      <w:r>
+        <w:rPr>
+          <w:lang w:val="es-CO"/>
+        </w:rPr>
+        <w:t xml:space="preserve"> </w:t>
+      </w:r>
+      <w:proofErr w:type="spellStart"/>
+      <w:r>
+        <w:rPr>
+          <w:lang w:val="es-CO"/>
+        </w:rPr>
+        <w:t>build</w:t>
+      </w:r>
+      <w:proofErr w:type="spellEnd"/>
+      <w:r>
+        <w:rPr>
+          <w:lang w:val="es-CO"/>
+        </w:rPr>
+        <w:t>'.</w:t>
+      </w:r>
+      <w:r>
+        <w:rPr>
+          <w:lang w:val="es-CO"/>
+        </w:rPr>
         <w:br/>
       </w:r>
       <w:r>
+        <w:rPr>
+          <w:noProof/>
+        </w:rPr>
         <w:drawing>
           <wp:inline distT="0" distB="0" distL="0" distR="0" wp14:anchorId="31A4F682" wp14:editId="70144DDB">
             <wp:extent cx="5486400" cy="2915920"/>
@@ -240,13 +624,55 @@
       </w:r>
     </w:p>
     <w:p>
-      <w:r>
-        <w:t>Captura 3: Resultado del comando 'docker images'.</w:t>
-      </w:r>
-      <w:r>
+      <w:pPr>
+        <w:rPr>
+          <w:lang w:val="es-CO"/>
+        </w:rPr>
+      </w:pPr>
+      <w:r>
+        <w:rPr>
+          <w:lang w:val="es-CO"/>
+        </w:rPr>
+        <w:t>Captura 3: Resultado del comando '</w:t>
+      </w:r>
+      <w:proofErr w:type="spellStart"/>
+      <w:r>
+        <w:rPr>
+          <w:lang w:val="es-CO"/>
+        </w:rPr>
+        <w:t>docker</w:t>
+      </w:r>
+      <w:proofErr w:type="spellEnd"/>
+      <w:r>
+        <w:rPr>
+          <w:lang w:val="es-CO"/>
+        </w:rPr>
+        <w:t xml:space="preserve"> </w:t>
+      </w:r>
+      <w:proofErr w:type="spellStart"/>
+      <w:r>
+        <w:rPr>
+          <w:lang w:val="es-CO"/>
+        </w:rPr>
+        <w:t>images</w:t>
+      </w:r>
+      <w:proofErr w:type="spellEnd"/>
+      <w:r>
+        <w:rPr>
+          <w:lang w:val="es-CO"/>
+        </w:rPr>
+        <w:t>'.</w:t>
+      </w:r>
+      <w:r>
+        <w:rPr>
+          <w:lang w:val="es-CO"/>
+        </w:rPr>
         <w:br/>
       </w:r>
       <w:r>
+        <w:rPr>
+          <w:noProof/>
+        </w:rPr>
         <w:drawing>
           <wp:inline distT="0" distB="0" distL="0" distR="0" wp14:anchorId="539F4CA3" wp14:editId="2A2CF71B">
             <wp:extent cx="5486400" cy="2907665"/>
@@ -284,36 +710,43 @@
         </w:drawing>
       </w:r>
       <w:r>
-        <w:t xml:space="preserve">2.3 </w:t>
-      </w:r>
-      <w:proofErr w:type="spellStart"/>
-      <w:r>
-        <w:t>Ejecución</w:t>
-      </w:r>
-      <w:proofErr w:type="spellEnd"/>
-      <w:r>
-        <w:t xml:space="preserve"> de </w:t>
-      </w:r>
-      <w:proofErr w:type="spellStart"/>
-      <w:r>
-        <w:t>Contenedor</w:t>
-      </w:r>
-      <w:proofErr w:type="spellEnd"/>
+        <w:rPr>
+          <w:lang w:val="es-CO"/>
+        </w:rPr>
+        <w:t>2.3 Ejecución de Contenedor</w:t>
+      </w:r>
     </w:p>
     <w:p>
-      <w:r>
+      <w:pPr>
+        <w:rPr>
+          <w:lang w:val="es-CO"/>
+        </w:rPr>
+      </w:pPr>
+      <w:r>
+        <w:rPr>
+          <w:lang w:val="es-CO"/>
+        </w:rPr>
         <w:lastRenderedPageBreak/>
-        <w:t xml:space="preserve">Captura 4: </w:t>
+        <w:t>Captura 4: Ejecución con '</w:t>
       </w:r>
       <w:proofErr w:type="spellStart"/>
       <w:r>
-        <w:t>Ejecución</w:t>
+        <w:rPr>
+          <w:lang w:val="es-CO"/>
+        </w:rPr>
+        <w:t>docker</w:t>
       </w:r>
       <w:proofErr w:type="spellEnd"/>
       <w:r>
-        <w:t xml:space="preserve"> con 'docker run'.</w:t>
-      </w:r>
-      <w:r>
+        <w:rPr>
+          <w:lang w:val="es-CO"/>
+        </w:rPr>
+        <w:t xml:space="preserve"> run'.</w:t>
+      </w:r>
+      <w:r>
+        <w:rPr>
+          <w:lang w:val="es-CO"/>
+        </w:rPr>
         <w:br/>
       </w:r>
       <w:r>
@@ -372,6 +805,9 @@
     </w:p>
     <w:p>
       <w:r>
+        <w:rPr>
+          <w:noProof/>
+        </w:rPr>
         <w:drawing>
           <wp:inline distT="0" distB="0" distL="0" distR="0" wp14:anchorId="39FAD673" wp14:editId="198926D0">
             <wp:extent cx="5486400" cy="2915920"/>
@@ -419,9 +855,9 @@
           <w:color w:val="auto"/>
           <w:sz w:val="22"/>
           <w:szCs w:val="22"/>
+          <w:lang w:val="es-CO"/>
         </w:rPr>
       </w:pPr>
-      <w:proofErr w:type="spellStart"/>
       <w:r>
         <w:rPr>
           <w:rFonts w:asciiTheme="minorHAnsi" w:eastAsiaTheme="minorEastAsia" w:hAnsiTheme="minorHAnsi" w:cstheme="minorBidi"/>
@@ -430,11 +866,12 @@
           <w:color w:val="auto"/>
           <w:sz w:val="22"/>
           <w:szCs w:val="22"/>
+          <w:lang w:val="es-CO"/>
         </w:rPr>
         <w:lastRenderedPageBreak/>
-        <w:t>Captura</w:t>
-      </w:r>
-      <w:proofErr w:type="spellEnd"/>
+        <w:t xml:space="preserve">Captura 5: </w:t>
+      </w:r>
+      <w:proofErr w:type="spellStart"/>
       <w:r>
         <w:rPr>
           <w:rFonts w:asciiTheme="minorHAnsi" w:eastAsiaTheme="minorEastAsia" w:hAnsiTheme="minorHAnsi" w:cstheme="minorBidi"/>
@@ -443,10 +880,11 @@
           <w:color w:val="auto"/>
           <w:sz w:val="22"/>
           <w:szCs w:val="22"/>
-        </w:rPr>
-        <w:t xml:space="preserve"> 5: Endpoint </w:t>
-      </w:r>
-      <w:proofErr w:type="spellStart"/>
+          <w:lang w:val="es-CO"/>
+        </w:rPr>
+        <w:t>Endpoint</w:t>
+      </w:r>
+      <w:proofErr w:type="spellEnd"/>
       <w:r>
         <w:rPr>
           <w:rFonts w:asciiTheme="minorHAnsi" w:eastAsiaTheme="minorEastAsia" w:hAnsiTheme="minorHAnsi" w:cstheme="minorBidi"/>
@@ -455,10 +893,11 @@
           <w:color w:val="auto"/>
           <w:sz w:val="22"/>
           <w:szCs w:val="22"/>
-        </w:rPr>
-        <w:t>funcionando</w:t>
-      </w:r>
-      <w:proofErr w:type="spellEnd"/>
+          <w:lang w:val="es-CO"/>
+        </w:rPr>
+        <w:t xml:space="preserve"> funcionando en </w:t>
+      </w:r>
+      <w:proofErr w:type="spellStart"/>
       <w:r>
         <w:rPr>
           <w:rFonts w:asciiTheme="minorHAnsi" w:eastAsiaTheme="minorEastAsia" w:hAnsiTheme="minorHAnsi" w:cstheme="minorBidi"/>
@@ -467,10 +906,11 @@
           <w:color w:val="auto"/>
           <w:sz w:val="22"/>
           <w:szCs w:val="22"/>
-        </w:rPr>
-        <w:t xml:space="preserve"> </w:t>
-      </w:r>
-      <w:proofErr w:type="spellStart"/>
+          <w:lang w:val="es-CO"/>
+        </w:rPr>
+        <w:t>Thunder</w:t>
+      </w:r>
+      <w:proofErr w:type="spellEnd"/>
       <w:r>
         <w:rPr>
           <w:rFonts w:asciiTheme="minorHAnsi" w:eastAsiaTheme="minorEastAsia" w:hAnsiTheme="minorHAnsi" w:cstheme="minorBidi"/>
@@ -479,10 +919,11 @@
           <w:color w:val="auto"/>
           <w:sz w:val="22"/>
           <w:szCs w:val="22"/>
-        </w:rPr>
-        <w:t>en</w:t>
-      </w:r>
-      <w:proofErr w:type="spellEnd"/>
+          <w:lang w:val="es-CO"/>
+        </w:rPr>
+        <w:t xml:space="preserve"> Client (Visual Studio </w:t>
+      </w:r>
+      <w:proofErr w:type="spellStart"/>
       <w:r>
         <w:rPr>
           <w:rFonts w:asciiTheme="minorHAnsi" w:eastAsiaTheme="minorEastAsia" w:hAnsiTheme="minorHAnsi" w:cstheme="minorBidi"/>
@@ -491,9 +932,11 @@
           <w:color w:val="auto"/>
           <w:sz w:val="22"/>
           <w:szCs w:val="22"/>
-        </w:rPr>
-        <w:t xml:space="preserve"> Thunder Client (Visual Studio Code).</w:t>
-      </w:r>
+          <w:lang w:val="es-CO"/>
+        </w:rPr>
+        <w:t>Code</w:t>
+      </w:r>
+      <w:proofErr w:type="spellEnd"/>
       <w:r>
         <w:rPr>
           <w:rFonts w:asciiTheme="minorHAnsi" w:eastAsiaTheme="minorEastAsia" w:hAnsiTheme="minorHAnsi" w:cstheme="minorBidi"/>
@@ -502,14 +945,28 @@
           <w:color w:val="auto"/>
           <w:sz w:val="22"/>
           <w:szCs w:val="22"/>
-        </w:rPr>
-        <w:br/>
+          <w:lang w:val="es-CO"/>
+        </w:rPr>
+        <w:t>).</w:t>
       </w:r>
       <w:r>
         <w:rPr>
           <w:rFonts w:asciiTheme="minorHAnsi" w:eastAsiaTheme="minorEastAsia" w:hAnsiTheme="minorHAnsi" w:cstheme="minorBidi"/>
           <w:b w:val="0"/>
           <w:bCs w:val="0"/>
+          <w:color w:val="auto"/>
+          <w:sz w:val="22"/>
+          <w:szCs w:val="22"/>
+          <w:lang w:val="es-CO"/>
+        </w:rPr>
+        <w:br/>
+      </w:r>
+      <w:r>
+        <w:rPr>
+          <w:rFonts w:asciiTheme="minorHAnsi" w:eastAsiaTheme="minorEastAsia" w:hAnsiTheme="minorHAnsi" w:cstheme="minorBidi"/>
+          <w:b w:val="0"/>
+          <w:bCs w:val="0"/>
+          <w:noProof/>
           <w:color w:val="auto"/>
           <w:sz w:val="22"/>
           <w:szCs w:val="22"/>
@@ -561,20 +1018,60 @@
           <w:color w:val="auto"/>
           <w:sz w:val="22"/>
           <w:szCs w:val="22"/>
+          <w:lang w:val="es-CO"/>
         </w:rPr>
       </w:pPr>
       <w:r>
-        <w:t>2.4 Uso de docker-compose</w:t>
-      </w:r>
+        <w:rPr>
+          <w:lang w:val="es-CO"/>
+        </w:rPr>
+        <w:t xml:space="preserve">2.4 Uso de </w:t>
+      </w:r>
+      <w:proofErr w:type="spellStart"/>
+      <w:r>
+        <w:rPr>
+          <w:lang w:val="es-CO"/>
+        </w:rPr>
+        <w:t>docker-compose</w:t>
+      </w:r>
+      <w:proofErr w:type="spellEnd"/>
     </w:p>
     <w:p>
-      <w:r>
-        <w:t>Captura 6: Contenido de docker-compose.yml.</w:t>
-      </w:r>
-      <w:r>
+      <w:pPr>
+        <w:rPr>
+          <w:lang w:val="es-CO"/>
+        </w:rPr>
+      </w:pPr>
+      <w:r>
+        <w:rPr>
+          <w:lang w:val="es-CO"/>
+        </w:rPr>
+        <w:t xml:space="preserve">Captura 6: Contenido de </w:t>
+      </w:r>
+      <w:proofErr w:type="spellStart"/>
+      <w:r>
+        <w:rPr>
+          <w:lang w:val="es-CO"/>
+        </w:rPr>
+        <w:t>docker-compose.yml</w:t>
+      </w:r>
+      <w:proofErr w:type="spellEnd"/>
+      <w:r>
+        <w:rPr>
+          <w:lang w:val="es-CO"/>
+        </w:rPr>
+        <w:t>.</w:t>
+      </w:r>
+      <w:r>
+        <w:rPr>
+          <w:lang w:val="es-CO"/>
+        </w:rPr>
         <w:br/>
       </w:r>
       <w:r>
+        <w:rPr>
+          <w:noProof/>
+        </w:rPr>
         <w:drawing>
           <wp:inline distT="0" distB="0" distL="0" distR="0" wp14:anchorId="2181F250" wp14:editId="20C2F3E4">
             <wp:extent cx="5486400" cy="2907665"/>
@@ -613,9 +1110,14 @@
       </w:r>
     </w:p>
     <w:p>
+      <w:proofErr w:type="spellStart"/>
       <w:r>
         <w:lastRenderedPageBreak/>
-        <w:t xml:space="preserve">Captura 7: </w:t>
+        <w:t>Captura</w:t>
+      </w:r>
+      <w:proofErr w:type="spellEnd"/>
+      <w:r>
+        <w:t xml:space="preserve"> 7: </w:t>
       </w:r>
       <w:proofErr w:type="spellStart"/>
       <w:r>
@@ -635,6 +1137,9 @@
         <w:br/>
       </w:r>
       <w:r>
+        <w:rPr>
+          <w:noProof/>
+        </w:rPr>
         <w:drawing>
           <wp:inline distT="0" distB="0" distL="0" distR="0" wp14:anchorId="597A3893" wp14:editId="53758CF5">
             <wp:extent cx="5486400" cy="2910205"/>
@@ -674,6 +1179,9 @@
     </w:p>
     <w:p>
       <w:r>
+        <w:rPr>
+          <w:noProof/>
+        </w:rPr>
         <w:drawing>
           <wp:inline distT="0" distB="0" distL="0" distR="0" wp14:anchorId="09F5C4AB" wp14:editId="060E7885">
             <wp:extent cx="5486400" cy="2915920"/>
@@ -712,14 +1220,56 @@
       </w:r>
     </w:p>
     <w:p>
-      <w:r>
+      <w:pPr>
+        <w:rPr>
+          <w:lang w:val="es-CO"/>
+        </w:rPr>
+      </w:pPr>
+      <w:r>
+        <w:rPr>
+          <w:lang w:val="es-CO"/>
+        </w:rPr>
         <w:lastRenderedPageBreak/>
-        <w:t>Captura 8: Resultado de 'docker ps'.</w:t>
-      </w:r>
-      <w:r>
+        <w:t>Captura 8: Resultado de '</w:t>
+      </w:r>
+      <w:proofErr w:type="spellStart"/>
+      <w:r>
+        <w:rPr>
+          <w:lang w:val="es-CO"/>
+        </w:rPr>
+        <w:t>docker</w:t>
+      </w:r>
+      <w:proofErr w:type="spellEnd"/>
+      <w:r>
+        <w:rPr>
+          <w:lang w:val="es-CO"/>
+        </w:rPr>
+        <w:t xml:space="preserve"> </w:t>
+      </w:r>
+      <w:proofErr w:type="spellStart"/>
+      <w:r>
+        <w:rPr>
+          <w:lang w:val="es-CO"/>
+        </w:rPr>
+        <w:t>ps</w:t>
+      </w:r>
+      <w:proofErr w:type="spellEnd"/>
+      <w:r>
+        <w:rPr>
+          <w:lang w:val="es-CO"/>
+        </w:rPr>
+        <w:t>'.</w:t>
+      </w:r>
+      <w:r>
+        <w:rPr>
+          <w:lang w:val="es-CO"/>
+        </w:rPr>
         <w:br/>
       </w:r>
       <w:r>
+        <w:rPr>
+          <w:noProof/>
+        </w:rPr>
         <w:drawing>
           <wp:inline distT="0" distB="0" distL="0" distR="0" wp14:anchorId="3AF88013" wp14:editId="2C03343B">
             <wp:extent cx="5486400" cy="2904490"/>
@@ -773,19 +1323,61 @@
     <w:p>
       <w:pPr>
         <w:pStyle w:val="Ttulo2"/>
+        <w:rPr>
+          <w:lang w:val="es-CO"/>
+        </w:rPr>
       </w:pPr>
       <w:r>
-        <w:t>3.1 Configuración del Workflow</w:t>
-      </w:r>
+        <w:rPr>
+          <w:lang w:val="es-CO"/>
+        </w:rPr>
+        <w:t xml:space="preserve">3.1 Configuración del </w:t>
+      </w:r>
+      <w:proofErr w:type="spellStart"/>
+      <w:r>
+        <w:rPr>
+          <w:lang w:val="es-CO"/>
+        </w:rPr>
+        <w:t>Workflow</w:t>
+      </w:r>
+      <w:proofErr w:type="spellEnd"/>
     </w:p>
     <w:p>
-      <w:r>
-        <w:t>Captura 9: Archivo ci-cd.yml en GitHub.</w:t>
-      </w:r>
-      <w:r>
+      <w:pPr>
+        <w:rPr>
+          <w:lang w:val="es-CO"/>
+        </w:rPr>
+      </w:pPr>
+      <w:r>
+        <w:rPr>
+          <w:lang w:val="es-CO"/>
+        </w:rPr>
+        <w:t xml:space="preserve">Captura 9: Archivo </w:t>
+      </w:r>
+      <w:proofErr w:type="spellStart"/>
+      <w:r>
+        <w:rPr>
+          <w:lang w:val="es-CO"/>
+        </w:rPr>
+        <w:t>ci-cd.yml</w:t>
+      </w:r>
+      <w:proofErr w:type="spellEnd"/>
+      <w:r>
+        <w:rPr>
+          <w:lang w:val="es-CO"/>
+        </w:rPr>
+        <w:t xml:space="preserve"> en GitHub.</w:t>
+      </w:r>
+      <w:r>
+        <w:rPr>
+          <w:lang w:val="es-CO"/>
+        </w:rPr>
         <w:br/>
       </w:r>
       <w:r>
+        <w:rPr>
+          <w:noProof/>
+        </w:rPr>
         <w:drawing>
           <wp:inline distT="0" distB="0" distL="0" distR="0" wp14:anchorId="668E61B6" wp14:editId="054EC065">
             <wp:extent cx="5486400" cy="2761615"/>
@@ -826,20 +1418,48 @@
     <w:p>
       <w:pPr>
         <w:pStyle w:val="Ttulo2"/>
+        <w:rPr>
+          <w:lang w:val="es-CO"/>
+        </w:rPr>
       </w:pPr>
       <w:r>
+        <w:rPr>
+          <w:lang w:val="es-CO"/>
+        </w:rPr>
         <w:lastRenderedPageBreak/>
-        <w:t>3.2 Configuración de Secrets</w:t>
-      </w:r>
+        <w:t xml:space="preserve">3.2 Configuración de </w:t>
+      </w:r>
+      <w:proofErr w:type="spellStart"/>
+      <w:r>
+        <w:rPr>
+          <w:lang w:val="es-CO"/>
+        </w:rPr>
+        <w:t>Secrets</w:t>
+      </w:r>
+      <w:proofErr w:type="spellEnd"/>
     </w:p>
     <w:p>
-      <w:r>
+      <w:pPr>
+        <w:rPr>
+          <w:lang w:val="es-CO"/>
+        </w:rPr>
+      </w:pPr>
+      <w:r>
+        <w:rPr>
+          <w:lang w:val="es-CO"/>
+        </w:rPr>
         <w:t>Captura 10: Configuración de secretos en GitHub.</w:t>
       </w:r>
       <w:r>
+        <w:rPr>
+          <w:lang w:val="es-CO"/>
+        </w:rPr>
         <w:br/>
       </w:r>
       <w:r>
+        <w:rPr>
+          <w:noProof/>
+        </w:rPr>
         <w:drawing>
           <wp:inline distT="0" distB="0" distL="0" distR="0" wp14:anchorId="0289942E" wp14:editId="534F6BDD">
             <wp:extent cx="5486400" cy="2761615"/>
@@ -880,19 +1500,53 @@
     <w:p>
       <w:pPr>
         <w:pStyle w:val="Ttulo2"/>
+        <w:rPr>
+          <w:lang w:val="es-CO"/>
+        </w:rPr>
       </w:pPr>
       <w:r>
+        <w:rPr>
+          <w:lang w:val="es-CO"/>
+        </w:rPr>
         <w:t>3.3 Ejecución del Pipeline</w:t>
       </w:r>
     </w:p>
     <w:p>
-      <w:r>
-        <w:t>Captura 11: Ejecución en GitHub Actions.</w:t>
-      </w:r>
-      <w:r>
+      <w:pPr>
+        <w:rPr>
+          <w:lang w:val="es-CO"/>
+        </w:rPr>
+      </w:pPr>
+      <w:r>
+        <w:rPr>
+          <w:lang w:val="es-CO"/>
+        </w:rPr>
+        <w:t xml:space="preserve">Captura 11: Ejecución en GitHub </w:t>
+      </w:r>
+      <w:proofErr w:type="spellStart"/>
+      <w:r>
+        <w:rPr>
+          <w:lang w:val="es-CO"/>
+        </w:rPr>
+        <w:t>Actions</w:t>
+      </w:r>
+      <w:proofErr w:type="spellEnd"/>
+      <w:r>
+        <w:rPr>
+          <w:lang w:val="es-CO"/>
+        </w:rPr>
+        <w:t>.</w:t>
+      </w:r>
+      <w:r>
+        <w:rPr>
+          <w:lang w:val="es-CO"/>
+        </w:rPr>
         <w:br/>
       </w:r>
       <w:r>
+        <w:rPr>
+          <w:noProof/>
+        </w:rPr>
         <w:drawing>
           <wp:inline distT="0" distB="0" distL="0" distR="0" wp14:anchorId="1E46805F" wp14:editId="6E3205DE">
             <wp:extent cx="5486400" cy="3084830"/>
@@ -931,14 +1585,42 @@
       </w:r>
     </w:p>
     <w:p>
-      <w:r>
+      <w:pPr>
+        <w:rPr>
+          <w:lang w:val="es-CO"/>
+        </w:rPr>
+      </w:pPr>
+      <w:r>
+        <w:rPr>
+          <w:lang w:val="es-CO"/>
+        </w:rPr>
         <w:lastRenderedPageBreak/>
-        <w:t>Captura 12: Imagen publicada en DockerHub.</w:t>
-      </w:r>
-      <w:r>
+        <w:t xml:space="preserve">Captura 12: Imagen publicada en </w:t>
+      </w:r>
+      <w:proofErr w:type="spellStart"/>
+      <w:r>
+        <w:rPr>
+          <w:lang w:val="es-CO"/>
+        </w:rPr>
+        <w:t>DockerHub</w:t>
+      </w:r>
+      <w:proofErr w:type="spellEnd"/>
+      <w:r>
+        <w:rPr>
+          <w:lang w:val="es-CO"/>
+        </w:rPr>
+        <w:t>.</w:t>
+      </w:r>
+      <w:r>
+        <w:rPr>
+          <w:lang w:val="es-CO"/>
+        </w:rPr>
         <w:br/>
       </w:r>
       <w:r>
+        <w:rPr>
+          <w:noProof/>
+        </w:rPr>
         <w:drawing>
           <wp:inline distT="0" distB="0" distL="0" distR="0" wp14:anchorId="6DE6197B" wp14:editId="2BF50482">
             <wp:extent cx="5486400" cy="2910205"/>
@@ -977,55 +1659,21 @@
       </w:r>
     </w:p>
     <w:p>
-      <w:proofErr w:type="spellStart"/>
-      <w:r>
-        <w:t>Captura</w:t>
-      </w:r>
-      <w:proofErr w:type="spellEnd"/>
-      <w:r>
-        <w:t xml:space="preserve"> 13: </w:t>
-      </w:r>
-      <w:proofErr w:type="spellStart"/>
-      <w:r>
-        <w:t>Contenedor</w:t>
-      </w:r>
-      <w:proofErr w:type="spellEnd"/>
-      <w:r>
-        <w:t xml:space="preserve"> </w:t>
-      </w:r>
-      <w:proofErr w:type="spellStart"/>
-      <w:r>
-        <w:t>corriendo</w:t>
-      </w:r>
-      <w:proofErr w:type="spellEnd"/>
-      <w:r>
-        <w:t xml:space="preserve"> </w:t>
-      </w:r>
-      <w:proofErr w:type="spellStart"/>
-      <w:r>
-        <w:t>en</w:t>
-      </w:r>
-      <w:proofErr w:type="spellEnd"/>
-      <w:r>
-        <w:t xml:space="preserve"> </w:t>
-      </w:r>
-      <w:proofErr w:type="spellStart"/>
-      <w:r>
-        <w:t>servidor</w:t>
-      </w:r>
-      <w:proofErr w:type="spellEnd"/>
-      <w:r>
-        <w:t xml:space="preserve"> </w:t>
-      </w:r>
-      <w:proofErr w:type="spellStart"/>
-      <w:r>
-        <w:t>remoto</w:t>
-      </w:r>
-      <w:proofErr w:type="spellEnd"/>
-      <w:r>
-        <w:t>.</w:t>
-      </w:r>
-      <w:r>
+      <w:pPr>
+        <w:rPr>
+          <w:lang w:val="es-CO"/>
+        </w:rPr>
+      </w:pPr>
+      <w:r>
+        <w:rPr>
+          <w:lang w:val="es-CO"/>
+        </w:rPr>
+        <w:t>Captura 13: Contenedor corriendo en servidor remoto.</w:t>
+      </w:r>
+      <w:r>
+        <w:rPr>
+          <w:lang w:val="es-CO"/>
+        </w:rPr>
         <w:br/>
       </w:r>
       <w:r>
@@ -1082,63 +1730,189 @@
         </w:drawing>
       </w:r>
       <w:r>
+        <w:rPr>
+          <w:lang w:val="es-CO"/>
+        </w:rPr>
         <w:t xml:space="preserve"> </w:t>
       </w:r>
     </w:p>
-    <w:p/>
-    <w:p/>
-    <w:p/>
     <w:p>
       <w:pPr>
-        <w:pStyle w:val="Ttulo1"/>
+        <w:rPr>
+          <w:lang w:val="es-CO"/>
+        </w:rPr>
       </w:pPr>
-      <w:r>
-        <w:lastRenderedPageBreak/>
-        <w:t>4. Evidencias de Pruebas</w:t>
-      </w:r>
     </w:p>
     <w:p>
-      <w:r>
-        <w:t xml:space="preserve">Aquí se incluyen capturas adicionales probando los endpoints </w:t>
-      </w:r>
-      <w:proofErr w:type="spellStart"/>
-      <w:r>
-        <w:t>principales</w:t>
-      </w:r>
-      <w:proofErr w:type="spellEnd"/>
-      <w:r>
-        <w:t xml:space="preserve"> del backend </w:t>
-      </w:r>
-      <w:proofErr w:type="spellStart"/>
-      <w:r>
-        <w:t>en</w:t>
-      </w:r>
-      <w:proofErr w:type="spellEnd"/>
-      <w:r>
-        <w:t xml:space="preserve"> </w:t>
-      </w:r>
-      <w:r>
-        <w:t>Thunder Client (Visual Studio Code)</w:t>
-      </w:r>
-      <w:r>
-        <w:t>.</w:t>
-      </w:r>
-      <w:r>
-        <w:br/>
-        <w:t>[Insertar imágenes de pruebas aquí]</w:t>
-      </w:r>
+      <w:pPr>
+        <w:rPr>
+          <w:lang w:val="es-CO"/>
+        </w:rPr>
+      </w:pPr>
+    </w:p>
+    <w:p>
+      <w:pPr>
+        <w:rPr>
+          <w:lang w:val="es-CO"/>
+        </w:rPr>
+      </w:pPr>
     </w:p>
     <w:p>
       <w:pPr>
         <w:pStyle w:val="Ttulo1"/>
+        <w:rPr>
+          <w:lang w:val="es-CO"/>
+        </w:rPr>
       </w:pPr>
       <w:r>
-        <w:t>5. Conclusiones</w:t>
+        <w:rPr>
+          <w:lang w:val="es-CO"/>
+        </w:rPr>
+        <w:lastRenderedPageBreak/>
+        <w:t>4. Evidencias de Pruebas</w:t>
       </w:r>
     </w:p>
     <w:p>
-      <w:r>
-        <w:t>La dockerización y la configuración del pipeline CI/CD permiten garantizar que el backend se ejecute de manera confiable, automatizada y replicable en cualquier entorno. Con este manual, se puede repetir el proceso de forma sencilla.</w:t>
+      <w:pPr>
+        <w:rPr>
+          <w:lang w:val="es-CO"/>
+        </w:rPr>
+      </w:pPr>
+      <w:r>
+        <w:rPr>
+          <w:lang w:val="es-CO"/>
+        </w:rPr>
+        <w:t xml:space="preserve">Aquí se incluyen capturas adicionales probando los </w:t>
+      </w:r>
+      <w:proofErr w:type="spellStart"/>
+      <w:r>
+        <w:rPr>
+          <w:lang w:val="es-CO"/>
+        </w:rPr>
+        <w:t>endpoints</w:t>
+      </w:r>
+      <w:proofErr w:type="spellEnd"/>
+      <w:r>
+        <w:rPr>
+          <w:lang w:val="es-CO"/>
+        </w:rPr>
+        <w:t xml:space="preserve"> principales del </w:t>
+      </w:r>
+      <w:proofErr w:type="spellStart"/>
+      <w:r>
+        <w:rPr>
+          <w:lang w:val="es-CO"/>
+        </w:rPr>
+        <w:t>backend</w:t>
+      </w:r>
+      <w:proofErr w:type="spellEnd"/>
+      <w:r>
+        <w:rPr>
+          <w:lang w:val="es-CO"/>
+        </w:rPr>
+        <w:t xml:space="preserve"> </w:t>
+      </w:r>
+      <w:r>
+        <w:rPr>
+          <w:lang w:val="es-CO"/>
+        </w:rPr>
+        <w:t xml:space="preserve">en </w:t>
+      </w:r>
+      <w:proofErr w:type="spellStart"/>
+      <w:r>
+        <w:rPr>
+          <w:lang w:val="es-CO"/>
+        </w:rPr>
+        <w:t>Thunder</w:t>
+      </w:r>
+      <w:proofErr w:type="spellEnd"/>
+      <w:r>
+        <w:rPr>
+          <w:lang w:val="es-CO"/>
+        </w:rPr>
+        <w:t xml:space="preserve"> Client (Visual Studio </w:t>
+      </w:r>
+      <w:proofErr w:type="spellStart"/>
+      <w:r>
+        <w:rPr>
+          <w:lang w:val="es-CO"/>
+        </w:rPr>
+        <w:t>Code</w:t>
+      </w:r>
+      <w:proofErr w:type="spellEnd"/>
+      <w:r>
+        <w:rPr>
+          <w:lang w:val="es-CO"/>
+        </w:rPr>
+        <w:t>)</w:t>
+      </w:r>
+      <w:r>
+        <w:rPr>
+          <w:lang w:val="es-CO"/>
+        </w:rPr>
+        <w:t>.</w:t>
+      </w:r>
+      <w:r>
+        <w:rPr>
+          <w:lang w:val="es-CO"/>
+        </w:rPr>
+        <w:br/>
+        <w:t>[Insertar imágenes de pruebas aquí]</w:t>
+      </w:r>
+    </w:p>
+    <w:p>
+      <w:pPr>
+        <w:pStyle w:val="Ttulo1"/>
+        <w:rPr>
+          <w:lang w:val="es-CO"/>
+        </w:rPr>
+      </w:pPr>
+      <w:r>
+        <w:rPr>
+          <w:lang w:val="es-CO"/>
+        </w:rPr>
+        <w:t>5. Conclusiones</w:t>
+      </w:r>
+    </w:p>
+    <w:p>
+      <w:pPr>
+        <w:rPr>
+          <w:lang w:val="es-CO"/>
+        </w:rPr>
+      </w:pPr>
+      <w:r>
+        <w:rPr>
+          <w:lang w:val="es-CO"/>
+        </w:rPr>
+        <w:t xml:space="preserve">La </w:t>
+      </w:r>
+      <w:proofErr w:type="spellStart"/>
+      <w:r>
+        <w:rPr>
+          <w:lang w:val="es-CO"/>
+        </w:rPr>
+        <w:t>dockerización</w:t>
+      </w:r>
+      <w:proofErr w:type="spellEnd"/>
+      <w:r>
+        <w:rPr>
+          <w:lang w:val="es-CO"/>
+        </w:rPr>
+        <w:t xml:space="preserve"> y la configuración del pipeline CI/CD permiten garantizar que el </w:t>
+      </w:r>
+      <w:proofErr w:type="spellStart"/>
+      <w:r>
+        <w:rPr>
+          <w:lang w:val="es-CO"/>
+        </w:rPr>
+        <w:t>backend</w:t>
+      </w:r>
+      <w:proofErr w:type="spellEnd"/>
+      <w:r>
+        <w:rPr>
+          <w:lang w:val="es-CO"/>
+        </w:rPr>
+        <w:t xml:space="preserve"> se ejecute de manera confiable, automatizada y replicable en cualquier entorno. Con este manual, se puede repetir el proceso de forma sencilla.</w:t>
       </w:r>
     </w:p>
     <w:sectPr>
@@ -1957,6 +2731,7 @@
   <w:style w:type="character" w:default="1" w:styleId="Fuentedeprrafopredeter">
     <w:name w:val="Default Paragraph Font"/>
     <w:uiPriority w:val="1"/>
+    <w:semiHidden/>
     <w:unhideWhenUsed/>
   </w:style>
   <w:style w:type="table" w:default="1" w:styleId="Tablanormal">

</xml_diff>